<commit_message>
chore(S1): re-export Sprint 1 deliverables after DEF-F1-01 fix
Refs: P11

Co-Authored-By: Claude Opus 5.5 <noreply@anthropic.com>
Claude-Session: https://claude.ai/code/session_018dPQXAbe9nEc4NmUbYrVzF
</commit_message>
<xml_diff>
--- a/deliverables/S1/HK261_SPM_FP_Team6_c3_SprintReport_S1.docx
+++ b/deliverables/S1/HK261_SPM_FP_Team6_c3_SprintReport_S1.docx
@@ -3570,7 +3570,7 @@
       </w:tr>
     </w:tbl>
     <w:bookmarkEnd w:id="31"/>
-    <w:bookmarkStart w:id="34" w:name="sprint-1--test-cases-f1"/>
+    <w:bookmarkStart w:id="35" w:name="sprint-1--test-cases-f1"/>
     <w:p>
       <w:pPr>
         <w:pStyle w:val="Heading1"/>
@@ -3708,6 +3708,56 @@
             </w:pPr>
             <w:r>
               <w:t xml:space="preserve">Test cases from F1 ACs; automated results from a real local run</w:t>
+            </w:r>
+          </w:p>
+        </w:tc>
+      </w:tr>
+      <w:tr>
+        <w:tc>
+          <w:tcPr/>
+          <w:p>
+            <w:pPr>
+              <w:pStyle w:val="Compact"/>
+              <w:jc w:val="left"/>
+            </w:pPr>
+            <w:r>
+              <w:t xml:space="preserve">1.1</w:t>
+            </w:r>
+          </w:p>
+        </w:tc>
+        <w:tc>
+          <w:tcPr/>
+          <w:p>
+            <w:pPr>
+              <w:pStyle w:val="Compact"/>
+              <w:jc w:val="left"/>
+            </w:pPr>
+            <w:r>
+              <w:t xml:space="preserve">30/10/2026</w:t>
+            </w:r>
+          </w:p>
+        </w:tc>
+        <w:tc>
+          <w:tcPr/>
+          <w:p>
+            <w:pPr>
+              <w:pStyle w:val="Compact"/>
+              <w:jc w:val="left"/>
+            </w:pPr>
+            <w:r>
+              <w:t xml:space="preserve">Hồ Du Tuấn Đạt (AI-assisted)</w:t>
+            </w:r>
+          </w:p>
+        </w:tc>
+        <w:tc>
+          <w:tcPr/>
+          <w:p>
+            <w:pPr>
+              <w:pStyle w:val="Compact"/>
+              <w:jc w:val="left"/>
+            </w:pPr>
+            <w:r>
+              <w:t xml:space="preserve">Manual run found defect DEF-F1-01 (TC-F1-15); expected result made precise; E2E assertion tightened</w:t>
             </w:r>
           </w:p>
         </w:tc>
@@ -5465,7 +5515,7 @@
               <w:jc w:val="left"/>
             </w:pPr>
             <w:r>
-              <w:t xml:space="preserve">Redirect to /login?next=…</w:t>
+              <w:t xml:space="preserve">Redirect to /login?next=%2Fadmin%2Faccounts; after login back on that page</w:t>
             </w:r>
           </w:p>
         </w:tc>
@@ -6426,13 +6476,13 @@
       </w:tr>
     </w:tbl>
     <w:bookmarkEnd w:id="32"/>
-    <w:bookmarkStart w:id="33" w:name="summary-local-automated"/>
+    <w:bookmarkStart w:id="33" w:name="defects-found"/>
     <w:p>
       <w:pPr>
         <w:pStyle w:val="Heading2"/>
       </w:pPr>
       <w:r>
-        <w:t xml:space="preserve">Summary (local automated)</w:t>
+        <w:t xml:space="preserve">Defects found</w:t>
       </w:r>
     </w:p>
     <w:tbl>
@@ -6462,67 +6512,67 @@
               <w:jc w:val="left"/>
             </w:pPr>
             <w:r>
-              <w:t xml:space="preserve">ACs</w:t>
-            </w:r>
-          </w:p>
-        </w:tc>
-        <w:tc>
-          <w:tcPr/>
-          <w:p>
-            <w:pPr>
-              <w:pStyle w:val="Compact"/>
-              <w:jc w:val="left"/>
-            </w:pPr>
-            <w:r>
-              <w:t xml:space="preserve">Test cases</w:t>
-            </w:r>
-          </w:p>
-        </w:tc>
-        <w:tc>
-          <w:tcPr/>
-          <w:p>
-            <w:pPr>
-              <w:pStyle w:val="Compact"/>
-              <w:jc w:val="left"/>
-            </w:pPr>
-            <w:r>
-              <w:t xml:space="preserve">Executed</w:t>
-            </w:r>
-          </w:p>
-        </w:tc>
-        <w:tc>
-          <w:tcPr/>
-          <w:p>
-            <w:pPr>
-              <w:pStyle w:val="Compact"/>
-              <w:jc w:val="left"/>
-            </w:pPr>
-            <w:r>
-              <w:t xml:space="preserve">Pass</w:t>
-            </w:r>
-          </w:p>
-        </w:tc>
-        <w:tc>
-          <w:tcPr/>
-          <w:p>
-            <w:pPr>
-              <w:pStyle w:val="Compact"/>
-              <w:jc w:val="left"/>
-            </w:pPr>
-            <w:r>
-              <w:t xml:space="preserve">Fail</w:t>
-            </w:r>
-          </w:p>
-        </w:tc>
-        <w:tc>
-          <w:tcPr/>
-          <w:p>
-            <w:pPr>
-              <w:pStyle w:val="Compact"/>
-              <w:jc w:val="left"/>
-            </w:pPr>
-            <w:r>
-              <w:t xml:space="preserve">Not run</w:t>
+              <w:t xml:space="preserve">ID</w:t>
+            </w:r>
+          </w:p>
+        </w:tc>
+        <w:tc>
+          <w:tcPr/>
+          <w:p>
+            <w:pPr>
+              <w:pStyle w:val="Compact"/>
+              <w:jc w:val="left"/>
+            </w:pPr>
+            <w:r>
+              <w:t xml:space="preserve">TC</w:t>
+            </w:r>
+          </w:p>
+        </w:tc>
+        <w:tc>
+          <w:tcPr/>
+          <w:p>
+            <w:pPr>
+              <w:pStyle w:val="Compact"/>
+              <w:jc w:val="left"/>
+            </w:pPr>
+            <w:r>
+              <w:t xml:space="preserve">Found</w:t>
+            </w:r>
+          </w:p>
+        </w:tc>
+        <w:tc>
+          <w:tcPr/>
+          <w:p>
+            <w:pPr>
+              <w:pStyle w:val="Compact"/>
+              <w:jc w:val="left"/>
+            </w:pPr>
+            <w:r>
+              <w:t xml:space="preserve">Description</w:t>
+            </w:r>
+          </w:p>
+        </w:tc>
+        <w:tc>
+          <w:tcPr/>
+          <w:p>
+            <w:pPr>
+              <w:pStyle w:val="Compact"/>
+              <w:jc w:val="left"/>
+            </w:pPr>
+            <w:r>
+              <w:t xml:space="preserve">Fix</w:t>
+            </w:r>
+          </w:p>
+        </w:tc>
+        <w:tc>
+          <w:tcPr/>
+          <w:p>
+            <w:pPr>
+              <w:pStyle w:val="Compact"/>
+              <w:jc w:val="left"/>
+            </w:pPr>
+            <w:r>
+              <w:t xml:space="preserve">Status</w:t>
             </w:r>
           </w:p>
         </w:tc>
@@ -6536,75 +6586,312 @@
               <w:jc w:val="left"/>
             </w:pPr>
             <w:r>
-              <w:t xml:space="preserve">24</w:t>
-            </w:r>
-          </w:p>
-        </w:tc>
-        <w:tc>
-          <w:tcPr/>
-          <w:p>
-            <w:pPr>
-              <w:pStyle w:val="Compact"/>
-              <w:jc w:val="left"/>
-            </w:pPr>
-            <w:r>
-              <w:t xml:space="preserve">24</w:t>
-            </w:r>
-          </w:p>
-        </w:tc>
-        <w:tc>
-          <w:tcPr/>
-          <w:p>
-            <w:pPr>
-              <w:pStyle w:val="Compact"/>
-              <w:jc w:val="left"/>
-            </w:pPr>
-            <w:r>
-              <w:t xml:space="preserve">21</w:t>
-            </w:r>
-          </w:p>
-        </w:tc>
-        <w:tc>
-          <w:tcPr/>
-          <w:p>
-            <w:pPr>
-              <w:pStyle w:val="Compact"/>
-              <w:jc w:val="left"/>
-            </w:pPr>
-            <w:r>
-              <w:t xml:space="preserve">21</w:t>
-            </w:r>
-          </w:p>
-        </w:tc>
-        <w:tc>
-          <w:tcPr/>
-          <w:p>
-            <w:pPr>
-              <w:pStyle w:val="Compact"/>
-              <w:jc w:val="left"/>
-            </w:pPr>
-            <w:r>
-              <w:t xml:space="preserve">0</w:t>
-            </w:r>
-          </w:p>
-        </w:tc>
-        <w:tc>
-          <w:tcPr/>
-          <w:p>
-            <w:pPr>
-              <w:pStyle w:val="Compact"/>
-              <w:jc w:val="left"/>
-            </w:pPr>
-            <w:r>
-              <w:t xml:space="preserve">3 (NFR-03 hosting)</w:t>
+              <w:t xml:space="preserve">DEF-F1-01</w:t>
+            </w:r>
+          </w:p>
+        </w:tc>
+        <w:tc>
+          <w:tcPr/>
+          <w:p>
+            <w:pPr>
+              <w:pStyle w:val="Compact"/>
+              <w:jc w:val="left"/>
+            </w:pPr>
+            <w:r>
+              <w:t xml:space="preserve">TC-F1-15</w:t>
+            </w:r>
+          </w:p>
+        </w:tc>
+        <w:tc>
+          <w:tcPr/>
+          <w:p>
+            <w:pPr>
+              <w:pStyle w:val="Compact"/>
+              <w:jc w:val="left"/>
+            </w:pPr>
+            <w:r>
+              <w:t xml:space="preserve">30/10/2026, manual run (Đạt)</w:t>
+            </w:r>
+          </w:p>
+        </w:tc>
+        <w:tc>
+          <w:tcPr/>
+          <w:p>
+            <w:pPr>
+              <w:pStyle w:val="Compact"/>
+              <w:jc w:val="left"/>
+            </w:pPr>
+            <w:r>
+              <w:t xml:space="preserve">Any admin URL redirected to</w:t>
+            </w:r>
+            <w:r>
+              <w:t xml:space="preserve"> </w:t>
+            </w:r>
+            <w:r>
+              <w:rPr>
+                <w:rStyle w:val="VerbatimChar"/>
+              </w:rPr>
+              <w:t xml:space="preserve">/login?next=%2Fadmin</w:t>
+            </w:r>
+            <w:r>
+              <w:t xml:space="preserve">: the admin layout guard used a fixed default path, so after login the user landed on the dashboard instead of the page requested. The automated check only tested for</w:t>
+            </w:r>
+            <w:r>
+              <w:t xml:space="preserve"> </w:t>
+            </w:r>
+            <w:r>
+              <w:rPr>
+                <w:rStyle w:val="VerbatimChar"/>
+              </w:rPr>
+              <w:t xml:space="preserve">next=</w:t>
+            </w:r>
+            <w:r>
+              <w:t xml:space="preserve"> </w:t>
+            </w:r>
+            <w:r>
+              <w:t xml:space="preserve">and missed it</w:t>
+            </w:r>
+          </w:p>
+        </w:tc>
+        <w:tc>
+          <w:tcPr/>
+          <w:p>
+            <w:pPr>
+              <w:pStyle w:val="Compact"/>
+              <w:jc w:val="left"/>
+            </w:pPr>
+            <w:r>
+              <w:rPr>
+                <w:rStyle w:val="VerbatimChar"/>
+              </w:rPr>
+              <w:t xml:space="preserve">src/middleware.js</w:t>
+            </w:r>
+            <w:r>
+              <w:t xml:space="preserve"> </w:t>
+            </w:r>
+            <w:r>
+              <w:t xml:space="preserve">passes the requested path;</w:t>
+            </w:r>
+            <w:r>
+              <w:t xml:space="preserve"> </w:t>
+            </w:r>
+            <w:r>
+              <w:rPr>
+                <w:rStyle w:val="VerbatimChar"/>
+              </w:rPr>
+              <w:t xml:space="preserve">requireAdmin</w:t>
+            </w:r>
+            <w:r>
+              <w:t xml:space="preserve"> </w:t>
+            </w:r>
+            <w:r>
+              <w:t xml:space="preserve">uses it; E2E now asserts the exact</w:t>
+            </w:r>
+            <w:r>
+              <w:t xml:space="preserve"> </w:t>
+            </w:r>
+            <w:r>
+              <w:rPr>
+                <w:rStyle w:val="VerbatimChar"/>
+              </w:rPr>
+              <w:t xml:space="preserve">next</w:t>
+            </w:r>
+          </w:p>
+        </w:tc>
+        <w:tc>
+          <w:tcPr/>
+          <w:p>
+            <w:pPr>
+              <w:pStyle w:val="Compact"/>
+              <w:jc w:val="left"/>
+            </w:pPr>
+            <w:r>
+              <w:t xml:space="preserve">Fixed, re-verified locally (curl); manual re-test TBD</w:t>
             </w:r>
           </w:p>
         </w:tc>
       </w:tr>
     </w:tbl>
     <w:bookmarkEnd w:id="33"/>
+    <w:bookmarkStart w:id="34" w:name="summary-local-automated"/>
+    <w:p>
+      <w:pPr>
+        <w:pStyle w:val="Heading2"/>
+      </w:pPr>
+      <w:r>
+        <w:t xml:space="preserve">Summary (local automated)</w:t>
+      </w:r>
+    </w:p>
+    <w:tbl>
+      <w:tblPr>
+        <w:tblStyle w:val="Table"/>
+        <w:tblW w:type="auto" w:w="0"/>
+        <w:tblLook w:firstRow="1" w:lastRow="0" w:firstColumn="0" w:lastColumn="0" w:noHBand="0" w:noVBand="0" w:val="0020"/>
+        <w:jc w:val="start"/>
+      </w:tblPr>
+      <w:tblGrid>
+        <w:gridCol w:w="1320"/>
+        <w:gridCol w:w="1320"/>
+        <w:gridCol w:w="1320"/>
+        <w:gridCol w:w="1320"/>
+        <w:gridCol w:w="1320"/>
+        <w:gridCol w:w="1320"/>
+      </w:tblGrid>
+      <w:tr>
+        <w:trPr>
+          <w:tblHeader w:val="true"/>
+        </w:trPr>
+        <w:tc>
+          <w:tcPr/>
+          <w:p>
+            <w:pPr>
+              <w:pStyle w:val="Compact"/>
+              <w:jc w:val="left"/>
+            </w:pPr>
+            <w:r>
+              <w:t xml:space="preserve">ACs</w:t>
+            </w:r>
+          </w:p>
+        </w:tc>
+        <w:tc>
+          <w:tcPr/>
+          <w:p>
+            <w:pPr>
+              <w:pStyle w:val="Compact"/>
+              <w:jc w:val="left"/>
+            </w:pPr>
+            <w:r>
+              <w:t xml:space="preserve">Test cases</w:t>
+            </w:r>
+          </w:p>
+        </w:tc>
+        <w:tc>
+          <w:tcPr/>
+          <w:p>
+            <w:pPr>
+              <w:pStyle w:val="Compact"/>
+              <w:jc w:val="left"/>
+            </w:pPr>
+            <w:r>
+              <w:t xml:space="preserve">Executed</w:t>
+            </w:r>
+          </w:p>
+        </w:tc>
+        <w:tc>
+          <w:tcPr/>
+          <w:p>
+            <w:pPr>
+              <w:pStyle w:val="Compact"/>
+              <w:jc w:val="left"/>
+            </w:pPr>
+            <w:r>
+              <w:t xml:space="preserve">Pass</w:t>
+            </w:r>
+          </w:p>
+        </w:tc>
+        <w:tc>
+          <w:tcPr/>
+          <w:p>
+            <w:pPr>
+              <w:pStyle w:val="Compact"/>
+              <w:jc w:val="left"/>
+            </w:pPr>
+            <w:r>
+              <w:t xml:space="preserve">Fail</w:t>
+            </w:r>
+          </w:p>
+        </w:tc>
+        <w:tc>
+          <w:tcPr/>
+          <w:p>
+            <w:pPr>
+              <w:pStyle w:val="Compact"/>
+              <w:jc w:val="left"/>
+            </w:pPr>
+            <w:r>
+              <w:t xml:space="preserve">Not run</w:t>
+            </w:r>
+          </w:p>
+        </w:tc>
+      </w:tr>
+      <w:tr>
+        <w:tc>
+          <w:tcPr/>
+          <w:p>
+            <w:pPr>
+              <w:pStyle w:val="Compact"/>
+              <w:jc w:val="left"/>
+            </w:pPr>
+            <w:r>
+              <w:t xml:space="preserve">24</w:t>
+            </w:r>
+          </w:p>
+        </w:tc>
+        <w:tc>
+          <w:tcPr/>
+          <w:p>
+            <w:pPr>
+              <w:pStyle w:val="Compact"/>
+              <w:jc w:val="left"/>
+            </w:pPr>
+            <w:r>
+              <w:t xml:space="preserve">24</w:t>
+            </w:r>
+          </w:p>
+        </w:tc>
+        <w:tc>
+          <w:tcPr/>
+          <w:p>
+            <w:pPr>
+              <w:pStyle w:val="Compact"/>
+              <w:jc w:val="left"/>
+            </w:pPr>
+            <w:r>
+              <w:t xml:space="preserve">21</w:t>
+            </w:r>
+          </w:p>
+        </w:tc>
+        <w:tc>
+          <w:tcPr/>
+          <w:p>
+            <w:pPr>
+              <w:pStyle w:val="Compact"/>
+              <w:jc w:val="left"/>
+            </w:pPr>
+            <w:r>
+              <w:t xml:space="preserve">21</w:t>
+            </w:r>
+          </w:p>
+        </w:tc>
+        <w:tc>
+          <w:tcPr/>
+          <w:p>
+            <w:pPr>
+              <w:pStyle w:val="Compact"/>
+              <w:jc w:val="left"/>
+            </w:pPr>
+            <w:r>
+              <w:t xml:space="preserve">0</w:t>
+            </w:r>
+          </w:p>
+        </w:tc>
+        <w:tc>
+          <w:tcPr/>
+          <w:p>
+            <w:pPr>
+              <w:pStyle w:val="Compact"/>
+              <w:jc w:val="left"/>
+            </w:pPr>
+            <w:r>
+              <w:t xml:space="preserve">3 (NFR-03 hosting)</w:t>
+            </w:r>
+          </w:p>
+        </w:tc>
+      </w:tr>
+    </w:tbl>
     <w:bookmarkEnd w:id="34"/>
-    <w:bookmarkStart w:id="43" w:name="Xed291cfe78450be34533a2ac40d7112b9e69f7e"/>
+    <w:bookmarkEnd w:id="35"/>
+    <w:bookmarkStart w:id="44" w:name="Xed291cfe78450be34533a2ac40d7112b9e69f7e"/>
     <w:p>
       <w:pPr>
         <w:pStyle w:val="Heading1"/>
@@ -6621,7 +6908,7 @@
         <w:t xml:space="preserve">Presenter: Sprint Leader S1. Structure follows [03 §8]. Fill the TBD cells with real data before class.</w:t>
       </w:r>
     </w:p>
-    <w:bookmarkStart w:id="35" w:name="X5975c86f064966e7e391fabc79b83eafed5e9c9"/>
+    <w:bookmarkStart w:id="36" w:name="X5975c86f064966e7e391fabc79b83eafed5e9c9"/>
     <w:p>
       <w:pPr>
         <w:pStyle w:val="Heading2"/>
@@ -6666,8 +6953,8 @@
         <w:t xml:space="preserve">Result: TBD (Met / Partly met / Not met) – items Done vs committed: TBD.</w:t>
       </w:r>
     </w:p>
-    <w:bookmarkEnd w:id="35"/>
-    <w:bookmarkStart w:id="36" w:name="X9b2a24815a310656da7780881b1ef1c21a0f449"/>
+    <w:bookmarkEnd w:id="36"/>
+    <w:bookmarkStart w:id="37" w:name="X9b2a24815a310656da7780881b1ef1c21a0f449"/>
     <w:p>
       <w:pPr>
         <w:pStyle w:val="Heading2"/>
@@ -6759,8 +7046,8 @@
         <w:t xml:space="preserve">Show password hash in the database (NFR-01/AC-01).</w:t>
       </w:r>
     </w:p>
-    <w:bookmarkEnd w:id="36"/>
-    <w:bookmarkStart w:id="37" w:name="X8f991b7b27b28ce28e2acb6f12aa91bdfedc79e"/>
+    <w:bookmarkEnd w:id="37"/>
+    <w:bookmarkStart w:id="38" w:name="X8f991b7b27b28ce28e2acb6f12aa91bdfedc79e"/>
     <w:p>
       <w:pPr>
         <w:pStyle w:val="Heading2"/>
@@ -6777,8 +7064,8 @@
         <w:t xml:space="preserve">TBD – export from Jira; explain flat or rising segments.</w:t>
       </w:r>
     </w:p>
-    <w:bookmarkEnd w:id="37"/>
-    <w:bookmarkStart w:id="38" w:name="Xf777ca499d76ab5a5e4989eb40700d346658afe"/>
+    <w:bookmarkEnd w:id="38"/>
+    <w:bookmarkStart w:id="39" w:name="Xf777ca499d76ab5a5e4989eb40700d346658afe"/>
     <w:p>
       <w:pPr>
         <w:pStyle w:val="Heading2"/>
@@ -6951,8 +7238,8 @@
         </w:tc>
       </w:tr>
     </w:tbl>
-    <w:bookmarkEnd w:id="38"/>
-    <w:bookmarkStart w:id="39" w:name="Xa69f50539a846290534e0d3b59fd6382ff473c7"/>
+    <w:bookmarkEnd w:id="39"/>
+    <w:bookmarkStart w:id="40" w:name="Xa69f50539a846290534e0d3b59fd6382ff473c7"/>
     <w:p>
       <w:pPr>
         <w:pStyle w:val="Heading2"/>
@@ -6969,8 +7256,8 @@
         <w:t xml:space="preserve">Top risks R01, R03, R05 (PMP-5); issue I-01 (late S1 artefacts).</w:t>
       </w:r>
     </w:p>
-    <w:bookmarkEnd w:id="39"/>
-    <w:bookmarkStart w:id="40" w:name="Xb9db6d8040a4999c56c4e3d24ac75457a168589"/>
+    <w:bookmarkEnd w:id="40"/>
+    <w:bookmarkStart w:id="41" w:name="Xb9db6d8040a4999c56c4e3d24ac75457a168589"/>
     <w:p>
       <w:pPr>
         <w:pStyle w:val="Heading2"/>
@@ -6999,8 +7286,8 @@
         <w:t xml:space="preserve">; record Sponsor decision and reason.</w:t>
       </w:r>
     </w:p>
-    <w:bookmarkEnd w:id="40"/>
-    <w:bookmarkStart w:id="41" w:name="Xbc40dad6b79b0381d2acb8142c0dc06fa2496cd"/>
+    <w:bookmarkEnd w:id="41"/>
+    <w:bookmarkStart w:id="42" w:name="Xbc40dad6b79b0381d2acb8142c0dc06fa2496cd"/>
     <w:p>
       <w:pPr>
         <w:pStyle w:val="Heading2"/>
@@ -7114,8 +7401,8 @@
         <w:t xml:space="preserve">| A3 | Log Completed Work in Jira the same day a task moves | Both | daily | 100 % of Done tasks have hours |</w:t>
       </w:r>
     </w:p>
-    <w:bookmarkEnd w:id="41"/>
-    <w:bookmarkStart w:id="42" w:name="Xbc2c4d702ce25a4f484210fbd73621edf2175fd"/>
+    <w:bookmarkEnd w:id="42"/>
+    <w:bookmarkStart w:id="43" w:name="Xbc2c4d702ce25a4f484210fbd73621edf2175fd"/>
     <w:p>
       <w:pPr>
         <w:pStyle w:val="Heading2"/>
@@ -7148,8 +7435,8 @@
         <w:t xml:space="preserve">S1 velocity [03 §6.2].</w:t>
       </w:r>
     </w:p>
-    <w:bookmarkEnd w:id="42"/>
     <w:bookmarkEnd w:id="43"/>
+    <w:bookmarkEnd w:id="44"/>
     <w:sectPr/>
   </w:body>
 </w:document>

</xml_diff>